<commit_message>
Update metadata in "Naming the Bones of the Armature" article for consistency and clarity
</commit_message>
<xml_diff>
--- a/Articles/2026/4_Blender_Tips_and_Tricks/10_Naming_the_Bones_of_the_Armature/Z Generic SEO for Blender Documents.docx
+++ b/Articles/2026/4_Blender_Tips_and_Tricks/10_Naming_the_Bones_of_the_Armature/Z Generic SEO for Blender Documents.docx
@@ -21,9 +21,19 @@
       <w:r>
         <w:t xml:space="preserve"> </w:t>
       </w:r>
+      <w:bookmarkStart w:id="1" w:name="_Hlk236750392"/>
+      <w:r>
+        <w:t xml:space="preserve">10 </w:t>
+      </w:r>
+      <w:bookmarkStart w:id="2" w:name="_Hlk236898043"/>
       <w:r>
         <w:t>Naming the Bones of the Armature</w:t>
       </w:r>
+      <w:r>
+        <w:t xml:space="preserve"> </w:t>
+      </w:r>
+      <w:bookmarkEnd w:id="1"/>
+      <w:bookmarkEnd w:id="2"/>
       <w:r>
         <w:t>"&gt;</w:t>
       </w:r>
@@ -120,37 +130,14 @@
         <w:t xml:space="preserve">explains </w:t>
       </w:r>
       <w:r>
-        <w:t xml:space="preserve">how to </w:t>
-      </w:r>
-      <w:bookmarkStart w:id="1" w:name="_Hlk236847261"/>
+        <w:t xml:space="preserve">about how to </w:t>
+      </w:r>
       <w:r>
         <w:t>n</w:t>
       </w:r>
       <w:r>
-        <w:t>am</w:t>
-      </w:r>
-      <w:r>
-        <w:t>e</w:t>
-      </w:r>
-      <w:r>
-        <w:t xml:space="preserve"> the </w:t>
-      </w:r>
-      <w:r>
-        <w:t>b</w:t>
-      </w:r>
-      <w:r>
-        <w:t xml:space="preserve">ones of the </w:t>
-      </w:r>
-      <w:r>
-        <w:t>a</w:t>
-      </w:r>
-      <w:r>
-        <w:t>rmature</w:t>
-      </w:r>
-      <w:r>
-        <w:t xml:space="preserve"> </w:t>
-      </w:r>
-      <w:bookmarkEnd w:id="1"/>
+        <w:t xml:space="preserve">aming the Bones of the Armature </w:t>
+      </w:r>
       <w:r>
         <w:t>in Blender</w:t>
       </w:r>
@@ -174,20 +161,17 @@
       <w:r>
         <w:t>" content="</w:t>
       </w:r>
-      <w:bookmarkStart w:id="2" w:name="_Hlk189913364"/>
+      <w:bookmarkStart w:id="3" w:name="_Hlk189913364"/>
       <w:r>
         <w:t xml:space="preserve"> </w:t>
       </w:r>
       <w:r>
-        <w:t>N</w:t>
-      </w:r>
-      <w:r>
-        <w:t>ame the bones of the armature</w:t>
+        <w:t>Naming the Bones of the Armature</w:t>
       </w:r>
       <w:r>
         <w:t xml:space="preserve">, </w:t>
       </w:r>
-      <w:bookmarkEnd w:id="2"/>
+      <w:bookmarkEnd w:id="3"/>
       <w:r>
         <w:t>Blender, 3D Modeling, Animation, Graphic Art</w:t>
       </w:r>
@@ -260,7 +244,7 @@
         <w:t>" content="</w:t>
       </w:r>
       <w:r>
-        <w:t>Wednesday, August 5, 2026</w:t>
+        <w:t>August 4, 2026</w:t>
       </w:r>
       <w:r>
         <w:t>" /&gt;</w:t>
@@ -285,10 +269,13 @@
         <w:t>" content="</w:t>
       </w:r>
       <w:r>
-        <w:t>https://starsindust.github.io/</w:t>
-      </w:r>
-      <w:r>
-        <w:t>Enlightenment/Articles/2026/4_Blender_Tips_and_Tricks/10_Naming_the_Bones_of_the_Armature/10_Naming_the_Bones_of_the_Arrmature.html</w:t>
+        <w:t xml:space="preserve"> </w:t>
+      </w:r>
+      <w:r>
+        <w:t>Enlightenment/Articles/2026/4_Blender_Tips_and_Tricks/10_Naming_the_Bones_Of_The_Armature/10_Naming_the_Bones_of_the_Arrmature.html</w:t>
+      </w:r>
+      <w:r>
+        <w:t xml:space="preserve"> </w:t>
       </w:r>
       <w:r>
         <w:t>"&gt;</w:t>

</xml_diff>

<commit_message>
Revised Article on Naming the Bones of the Armature
</commit_message>
<xml_diff>
--- a/Articles/2026/4_Blender_Tips_and_Tricks/10_Naming_the_Bones_of_the_Armature/Z Generic SEO for Blender Documents.docx
+++ b/Articles/2026/4_Blender_Tips_and_Tricks/10_Naming_the_Bones_of_the_Armature/Z Generic SEO for Blender Documents.docx
@@ -272,10 +272,7 @@
         <w:t xml:space="preserve"> </w:t>
       </w:r>
       <w:r>
-        <w:t>Enlightenment/Articles/2026/4_Blender_Tips_and_Tricks/10_Naming_the_Bones_Of_The_Armature/10_Naming_the_Bones_of_the_Arrmature.html</w:t>
-      </w:r>
-      <w:r>
-        <w:t xml:space="preserve"> </w:t>
+        <w:t>https://starsindust.github.io/ Enlightenment/Articles/2026/4_Blender_Tips_and_Tricks/10_Naming_the_Bones_Of_The_Armature/10_Naming_the_Bones_of_the_Arrmature.html</w:t>
       </w:r>
       <w:r>
         <w:t>"&gt;</w:t>

</xml_diff>

<commit_message>
Writing Articles and updating daily cartoon
</commit_message>
<xml_diff>
--- a/Articles/2026/4_Blender_Tips_and_Tricks/10_Naming_the_Bones_of_the_Armature/Z Generic SEO for Blender Documents.docx
+++ b/Articles/2026/4_Blender_Tips_and_Tricks/10_Naming_the_Bones_of_the_Armature/Z Generic SEO for Blender Documents.docx
@@ -281,10 +281,7 @@
         <w:t>https://starsindust.github.io/</w:t>
       </w:r>
       <w:r>
-        <w:t>Enlightenment/Articles/2026/4_Blender_Tips_and_Tricks/10_Naming_the_Bones_Of_The_Armature/10_Naming_the_Bones_of_the_Armature.html</w:t>
-      </w:r>
-      <w:r>
-        <w:t xml:space="preserve"> </w:t>
+        <w:t>Enlightenment/Articles/2026/4_Blender_Tips_and_Tricks/10_Naming_the_Bones_of_the_Armature/10_Naming_the_Bones_of_the_Armature.html</w:t>
       </w:r>
       <w:r>
         <w:t>"&gt;</w:t>

</xml_diff>